<commit_message>
refactor: Improve document generation script error handling
- Add descriptive titles for each document
- Implement proper error logging to /tmp/doc-generation-logs/
- Add success confirmation messages for each generated file
- Improve GitHub Actions commit message with file counts
- Better debugging with log files instead of suppressing all errors

Co-authored-by: wesleycamargo <897126+wesleycamargo@users.noreply.github.com>
</commit_message>
<xml_diff>
--- a/downloads/README.docx
+++ b/downloads/README.docx
@@ -7,7 +7,7 @@
         <w:pStyle w:val="Title"/>
       </w:pPr>
       <w:r>
-        <w:t xml:space="preserve">Release Engine - README</w:t>
+        <w:t xml:space="preserve">Release Engine Workload Patterns - Repository Overview</w:t>
       </w:r>
     </w:p>
     <w:sdt>
@@ -36,7 +36,7 @@
         </w:p>
       </w:sdtContent>
     </w:sdt>
-    <w:bookmarkStart w:id="81" w:name="Xbb62038d1d19258b13990d696ac305c0364a58b"/>
+    <w:bookmarkStart w:id="85" w:name="Xbb62038d1d19258b13990d696ac305c0364a58b"/>
     <w:p>
       <w:pPr>
         <w:pStyle w:val="Heading1"/>
@@ -4794,16 +4794,386 @@
     </w:p>
     <w:bookmarkEnd w:id="73"/>
     <w:bookmarkEnd w:id="74"/>
-    <w:bookmarkStart w:id="80" w:name="X4f0eb018a3b5169b1715e3ea5fa42e079924894"/>
+    <w:bookmarkStart w:id="78" w:name="X43019220e518b4e8ecb355a36dad4871903623f"/>
     <w:p>
       <w:pPr>
         <w:pStyle w:val="Heading2"/>
       </w:pPr>
       <w:r>
+        <w:t xml:space="preserve">📥 Documentation Export Feature</w:t>
+      </w:r>
+    </w:p>
+    <w:p>
+      <w:pPr>
+        <w:pStyle w:val="FirstParagraph"/>
+      </w:pPr>
+      <w:r>
+        <w:t xml:space="preserve">All documentation in this repository is available for download in PDF and DOCX formats, making it easy to:</w:t>
+      </w:r>
+    </w:p>
+    <w:p>
+      <w:pPr>
+        <w:numPr>
+          <w:ilvl w:val="0"/>
+          <w:numId w:val="1021"/>
+        </w:numPr>
+        <w:pStyle w:val="Compact"/>
+      </w:pPr>
+      <w:r>
+        <w:rPr>
+          <w:bCs/>
+          <w:b/>
+        </w:rPr>
+        <w:t xml:space="preserve">Share</w:t>
+      </w:r>
+      <w:r>
+        <w:t xml:space="preserve"> </w:t>
+      </w:r>
+      <w:r>
+        <w:t xml:space="preserve">documentation with team members offline</w:t>
+      </w:r>
+    </w:p>
+    <w:p>
+      <w:pPr>
+        <w:numPr>
+          <w:ilvl w:val="0"/>
+          <w:numId w:val="1021"/>
+        </w:numPr>
+        <w:pStyle w:val="Compact"/>
+      </w:pPr>
+      <w:r>
+        <w:rPr>
+          <w:bCs/>
+          <w:b/>
+        </w:rPr>
+        <w:t xml:space="preserve">Archive</w:t>
+      </w:r>
+      <w:r>
+        <w:t xml:space="preserve"> </w:t>
+      </w:r>
+      <w:r>
+        <w:t xml:space="preserve">documentation for compliance and audit purposes</w:t>
+      </w:r>
+    </w:p>
+    <w:p>
+      <w:pPr>
+        <w:numPr>
+          <w:ilvl w:val="0"/>
+          <w:numId w:val="1021"/>
+        </w:numPr>
+        <w:pStyle w:val="Compact"/>
+      </w:pPr>
+      <w:r>
+        <w:rPr>
+          <w:bCs/>
+          <w:b/>
+        </w:rPr>
+        <w:t xml:space="preserve">Print</w:t>
+      </w:r>
+      <w:r>
+        <w:t xml:space="preserve"> </w:t>
+      </w:r>
+      <w:r>
+        <w:t xml:space="preserve">documentation for workshops and training sessions</w:t>
+      </w:r>
+    </w:p>
+    <w:p>
+      <w:pPr>
+        <w:numPr>
+          <w:ilvl w:val="0"/>
+          <w:numId w:val="1021"/>
+        </w:numPr>
+        <w:pStyle w:val="Compact"/>
+      </w:pPr>
+      <w:r>
+        <w:rPr>
+          <w:bCs/>
+          <w:b/>
+        </w:rPr>
+        <w:t xml:space="preserve">Customize</w:t>
+      </w:r>
+      <w:r>
+        <w:t xml:space="preserve"> </w:t>
+      </w:r>
+      <w:r>
+        <w:t xml:space="preserve">DOCX files with your organization's branding</w:t>
+      </w:r>
+    </w:p>
+    <w:bookmarkStart w:id="75" w:name="available-exports"/>
+    <w:p>
+      <w:pPr>
+        <w:pStyle w:val="Heading3"/>
+      </w:pPr>
+      <w:r>
+        <w:t xml:space="preserve">Available Exports</w:t>
+      </w:r>
+    </w:p>
+    <w:p>
+      <w:pPr>
+        <w:pStyle w:val="FirstParagraph"/>
+      </w:pPr>
+      <w:r>
+        <w:t xml:space="preserve">Visit the</w:t>
+      </w:r>
+      <w:r>
+        <w:t xml:space="preserve"> </w:t>
+      </w:r>
+      <w:hyperlink r:id="rId33">
+        <w:r>
+          <w:rPr>
+            <w:rStyle w:val="Hyperlink"/>
+            <w:bCs/>
+            <w:b/>
+          </w:rPr>
+          <w:t xml:space="preserve">Documentation Downloads</w:t>
+        </w:r>
+      </w:hyperlink>
+      <w:r>
+        <w:t xml:space="preserve"> </w:t>
+      </w:r>
+      <w:r>
+        <w:t xml:space="preserve">page to access:</w:t>
+      </w:r>
+    </w:p>
+    <w:p>
+      <w:pPr>
+        <w:numPr>
+          <w:ilvl w:val="0"/>
+          <w:numId w:val="1022"/>
+        </w:numPr>
+        <w:pStyle w:val="Compact"/>
+      </w:pPr>
+      <w:r>
+        <w:t xml:space="preserve">Repository overview (README)</w:t>
+      </w:r>
+    </w:p>
+    <w:p>
+      <w:pPr>
+        <w:numPr>
+          <w:ilvl w:val="0"/>
+          <w:numId w:val="1022"/>
+        </w:numPr>
+        <w:pStyle w:val="Compact"/>
+      </w:pPr>
+      <w:r>
+        <w:t xml:space="preserve">Comprehensive patterns guide (PATTERNS_OVERVIEW)</w:t>
+      </w:r>
+    </w:p>
+    <w:p>
+      <w:pPr>
+        <w:numPr>
+          <w:ilvl w:val="0"/>
+          <w:numId w:val="1022"/>
+        </w:numPr>
+        <w:pStyle w:val="Compact"/>
+      </w:pPr>
+      <w:r>
+        <w:t xml:space="preserve">Individual pattern documentation (all three patterns)</w:t>
+      </w:r>
+    </w:p>
+    <w:bookmarkEnd w:id="75"/>
+    <w:bookmarkStart w:id="76" w:name="how-it-works"/>
+    <w:p>
+      <w:pPr>
+        <w:pStyle w:val="Heading3"/>
+      </w:pPr>
+      <w:r>
+        <w:t xml:space="preserve">How It Works</w:t>
+      </w:r>
+    </w:p>
+    <w:p>
+      <w:pPr>
+        <w:numPr>
+          <w:ilvl w:val="0"/>
+          <w:numId w:val="1023"/>
+        </w:numPr>
+        <w:pStyle w:val="Compact"/>
+      </w:pPr>
+      <w:r>
+        <w:rPr>
+          <w:bCs/>
+          <w:b/>
+        </w:rPr>
+        <w:t xml:space="preserve">Automatic Generation</w:t>
+      </w:r>
+      <w:r>
+        <w:t xml:space="preserve">: Documents are automatically regenerated on every push to main branch</w:t>
+      </w:r>
+    </w:p>
+    <w:p>
+      <w:pPr>
+        <w:numPr>
+          <w:ilvl w:val="0"/>
+          <w:numId w:val="1023"/>
+        </w:numPr>
+        <w:pStyle w:val="Compact"/>
+      </w:pPr>
+      <w:r>
+        <w:rPr>
+          <w:bCs/>
+          <w:b/>
+        </w:rPr>
+        <w:t xml:space="preserve">Tools Used</w:t>
+      </w:r>
+      <w:r>
+        <w:t xml:space="preserve">:</w:t>
+      </w:r>
+    </w:p>
+    <w:p>
+      <w:pPr>
+        <w:numPr>
+          <w:ilvl w:val="1"/>
+          <w:numId w:val="1024"/>
+        </w:numPr>
+        <w:pStyle w:val="Compact"/>
+      </w:pPr>
+      <w:r>
+        <w:t xml:space="preserve">DocFX for website generation</w:t>
+      </w:r>
+    </w:p>
+    <w:p>
+      <w:pPr>
+        <w:numPr>
+          <w:ilvl w:val="1"/>
+          <w:numId w:val="1024"/>
+        </w:numPr>
+        <w:pStyle w:val="Compact"/>
+      </w:pPr>
+      <w:r>
+        <w:t xml:space="preserve">Pandoc for DOCX generation (Microsoft Word format)</w:t>
+      </w:r>
+    </w:p>
+    <w:p>
+      <w:pPr>
+        <w:numPr>
+          <w:ilvl w:val="1"/>
+          <w:numId w:val="1024"/>
+        </w:numPr>
+        <w:pStyle w:val="Compact"/>
+      </w:pPr>
+      <w:r>
+        <w:t xml:space="preserve">wkhtmltopdf for high-quality PDF generation</w:t>
+      </w:r>
+    </w:p>
+    <w:p>
+      <w:pPr>
+        <w:numPr>
+          <w:ilvl w:val="0"/>
+          <w:numId w:val="1023"/>
+        </w:numPr>
+        <w:pStyle w:val="Compact"/>
+      </w:pPr>
+      <w:r>
+        <w:rPr>
+          <w:bCs/>
+          <w:b/>
+        </w:rPr>
+        <w:t xml:space="preserve">CI/CD Integration</w:t>
+      </w:r>
+      <w:r>
+        <w:t xml:space="preserve">: GitHub Actions workflow handles the entire generation process</w:t>
+      </w:r>
+    </w:p>
+    <w:p>
+      <w:pPr>
+        <w:numPr>
+          <w:ilvl w:val="0"/>
+          <w:numId w:val="1023"/>
+        </w:numPr>
+        <w:pStyle w:val="Compact"/>
+      </w:pPr>
+      <w:r>
+        <w:rPr>
+          <w:bCs/>
+          <w:b/>
+        </w:rPr>
+        <w:t xml:space="preserve">Always Current</w:t>
+      </w:r>
+      <w:r>
+        <w:t xml:space="preserve">: Exports stay synchronized with the latest documentation</w:t>
+      </w:r>
+    </w:p>
+    <w:bookmarkEnd w:id="76"/>
+    <w:bookmarkStart w:id="77" w:name="manual-generation"/>
+    <w:p>
+      <w:pPr>
+        <w:pStyle w:val="Heading3"/>
+      </w:pPr>
+      <w:r>
+        <w:t xml:space="preserve">Manual Generation</w:t>
+      </w:r>
+    </w:p>
+    <w:p>
+      <w:pPr>
+        <w:pStyle w:val="FirstParagraph"/>
+      </w:pPr>
+      <w:r>
+        <w:t xml:space="preserve">To generate documents locally:</w:t>
+      </w:r>
+    </w:p>
+    <w:p>
+      <w:pPr>
+        <w:pStyle w:val="SourceCode"/>
+      </w:pPr>
+      <w:r>
+        <w:rPr>
+          <w:rStyle w:val="CommentTok"/>
+        </w:rPr>
+        <w:t xml:space="preserve"># Requires Pandoc and wkhtmltopdf</w:t>
+      </w:r>
+      <w:r>
+        <w:br/>
+      </w:r>
+      <w:r>
+        <w:rPr>
+          <w:rStyle w:val="FunctionTok"/>
+        </w:rPr>
+        <w:t xml:space="preserve">bash</w:t>
+      </w:r>
+      <w:r>
+        <w:rPr>
+          <w:rStyle w:val="NormalTok"/>
+        </w:rPr>
+        <w:t xml:space="preserve"> scripts/generate-docs.sh</w:t>
+      </w:r>
+    </w:p>
+    <w:p>
+      <w:pPr>
+        <w:pStyle w:val="FirstParagraph"/>
+      </w:pPr>
+      <w:r>
+        <w:t xml:space="preserve">See</w:t>
+      </w:r>
+      <w:r>
+        <w:t xml:space="preserve"> </w:t>
+      </w:r>
+      <w:hyperlink r:id="rId33">
+        <w:r>
+          <w:rPr>
+            <w:rStyle w:val="Hyperlink"/>
+          </w:rPr>
+          <w:t xml:space="preserve">docs/DOWNLOADS.md</w:t>
+        </w:r>
+      </w:hyperlink>
+      <w:r>
+        <w:t xml:space="preserve"> </w:t>
+      </w:r>
+      <w:r>
+        <w:t xml:space="preserve">for installation instructions and more details.</w:t>
+      </w:r>
+    </w:p>
+    <w:bookmarkEnd w:id="77"/>
+    <w:bookmarkEnd w:id="78"/>
+    <w:bookmarkStart w:id="84" w:name="X4f0eb018a3b5169b1715e3ea5fa42e079924894"/>
+    <w:p>
+      <w:pPr>
+        <w:pStyle w:val="Heading2"/>
+      </w:pPr>
+      <w:r>
         <w:t xml:space="preserve">📞 Support and Resources</w:t>
       </w:r>
     </w:p>
-    <w:bookmarkStart w:id="75" w:name="getting-help"/>
+    <w:bookmarkStart w:id="79" w:name="getting-help"/>
     <w:p>
       <w:pPr>
         <w:pStyle w:val="Heading3"/>
@@ -4816,7 +5186,7 @@
       <w:pPr>
         <w:numPr>
           <w:ilvl w:val="0"/>
-          <w:numId w:val="1021"/>
+          <w:numId w:val="1025"/>
         </w:numPr>
         <w:pStyle w:val="Compact"/>
       </w:pPr>
@@ -4846,7 +5216,7 @@
       <w:pPr>
         <w:numPr>
           <w:ilvl w:val="0"/>
-          <w:numId w:val="1021"/>
+          <w:numId w:val="1025"/>
         </w:numPr>
         <w:pStyle w:val="Compact"/>
       </w:pPr>
@@ -4865,7 +5235,7 @@
       <w:pPr>
         <w:numPr>
           <w:ilvl w:val="0"/>
-          <w:numId w:val="1021"/>
+          <w:numId w:val="1025"/>
         </w:numPr>
         <w:pStyle w:val="Compact"/>
       </w:pPr>
@@ -4884,7 +5254,7 @@
       <w:pPr>
         <w:numPr>
           <w:ilvl w:val="0"/>
-          <w:numId w:val="1021"/>
+          <w:numId w:val="1025"/>
         </w:numPr>
         <w:pStyle w:val="Compact"/>
       </w:pPr>
@@ -4899,8 +5269,8 @@
         <w:t xml:space="preserve">: Follow contribution guidelines for improvements</w:t>
       </w:r>
     </w:p>
-    <w:bookmarkEnd w:id="75"/>
-    <w:bookmarkStart w:id="79" w:name="related-resources"/>
+    <w:bookmarkEnd w:id="79"/>
+    <w:bookmarkStart w:id="83" w:name="related-resources"/>
     <w:p>
       <w:pPr>
         <w:pStyle w:val="Heading3"/>
@@ -4913,7 +5283,7 @@
       <w:pPr>
         <w:numPr>
           <w:ilvl w:val="0"/>
-          <w:numId w:val="1022"/>
+          <w:numId w:val="1026"/>
         </w:numPr>
         <w:pStyle w:val="Compact"/>
       </w:pPr>
@@ -4935,11 +5305,11 @@
       <w:pPr>
         <w:numPr>
           <w:ilvl w:val="0"/>
-          <w:numId w:val="1022"/>
-        </w:numPr>
-        <w:pStyle w:val="Compact"/>
-      </w:pPr>
-      <w:hyperlink r:id="rId76">
+          <w:numId w:val="1026"/>
+        </w:numPr>
+        <w:pStyle w:val="Compact"/>
+      </w:pPr>
+      <w:hyperlink r:id="rId80">
         <w:r>
           <w:rPr>
             <w:rStyle w:val="Hyperlink"/>
@@ -4957,11 +5327,11 @@
       <w:pPr>
         <w:numPr>
           <w:ilvl w:val="0"/>
-          <w:numId w:val="1022"/>
-        </w:numPr>
-        <w:pStyle w:val="Compact"/>
-      </w:pPr>
-      <w:hyperlink r:id="rId77">
+          <w:numId w:val="1026"/>
+        </w:numPr>
+        <w:pStyle w:val="Compact"/>
+      </w:pPr>
+      <w:hyperlink r:id="rId81">
         <w:r>
           <w:rPr>
             <w:rStyle w:val="Hyperlink"/>
@@ -4976,11 +5346,11 @@
       <w:pPr>
         <w:numPr>
           <w:ilvl w:val="0"/>
-          <w:numId w:val="1022"/>
-        </w:numPr>
-        <w:pStyle w:val="Compact"/>
-      </w:pPr>
-      <w:hyperlink r:id="rId78">
+          <w:numId w:val="1026"/>
+        </w:numPr>
+        <w:pStyle w:val="Compact"/>
+      </w:pPr>
+      <w:hyperlink r:id="rId82">
         <w:r>
           <w:rPr>
             <w:rStyle w:val="Hyperlink"/>
@@ -5010,9 +5380,9 @@
         <w:t xml:space="preserve">This template repository enables organizations to create sophisticated workload deployment patterns while maintaining consistency and leveraging community improvements. Clone, customize, and extend to meet your organization's specific needs.</w:t>
       </w:r>
     </w:p>
-    <w:bookmarkEnd w:id="79"/>
-    <w:bookmarkEnd w:id="80"/>
-    <w:bookmarkEnd w:id="81"/>
+    <w:bookmarkEnd w:id="83"/>
+    <w:bookmarkEnd w:id="84"/>
+    <w:bookmarkEnd w:id="85"/>
     <w:sectPr/>
   </w:body>
 </w:document>
@@ -5455,6 +5825,45 @@
     <w:abstractNumId w:val="991"/>
   </w:num>
   <w:num w:numId="1022">
+    <w:abstractNumId w:val="991"/>
+  </w:num>
+  <w:num w:numId="1023">
+    <w:abstractNumId w:val="99411"/>
+    <w:lvlOverride w:ilvl="0">
+      <w:startOverride w:val="1"/>
+    </w:lvlOverride>
+    <w:lvlOverride w:ilvl="1">
+      <w:startOverride w:val="1"/>
+    </w:lvlOverride>
+    <w:lvlOverride w:ilvl="2">
+      <w:startOverride w:val="1"/>
+    </w:lvlOverride>
+    <w:lvlOverride w:ilvl="3">
+      <w:startOverride w:val="1"/>
+    </w:lvlOverride>
+    <w:lvlOverride w:ilvl="4">
+      <w:startOverride w:val="1"/>
+    </w:lvlOverride>
+    <w:lvlOverride w:ilvl="5">
+      <w:startOverride w:val="1"/>
+    </w:lvlOverride>
+    <w:lvlOverride w:ilvl="6">
+      <w:startOverride w:val="1"/>
+    </w:lvlOverride>
+    <w:lvlOverride w:ilvl="7">
+      <w:startOverride w:val="1"/>
+    </w:lvlOverride>
+    <w:lvlOverride w:ilvl="8">
+      <w:startOverride w:val="1"/>
+    </w:lvlOverride>
+  </w:num>
+  <w:num w:numId="1024">
+    <w:abstractNumId w:val="991"/>
+  </w:num>
+  <w:num w:numId="1025">
+    <w:abstractNumId w:val="991"/>
+  </w:num>
+  <w:num w:numId="1026">
     <w:abstractNumId w:val="991"/>
   </w:num>
 </w:numbering>

</xml_diff>